<commit_message>
feat: cinematic projects, dock navigation, 3D ID badge, orbital academic timeline, and ACM tech team updates
</commit_message>
<xml_diff>
--- a/Vagish_Resume.docx
+++ b/Vagish_Resume.docx
@@ -1,6 +1,6 @@
 
 <file path=word/document.xml><?xml version="1.0" encoding="utf-8"?>
-<w:document xmlns:wpc="http://schemas.microsoft.com/office/word/2010/wordprocessingCanvas" xmlns:cx="http://schemas.microsoft.com/office/drawing/2014/chartex" xmlns:cx1="http://schemas.microsoft.com/office/drawing/2015/9/8/chartex" xmlns:cx2="http://schemas.microsoft.com/office/drawing/2015/10/21/chartex" xmlns:cx3="http://schemas.microsoft.com/office/drawing/2016/5/9/chartex" xmlns:cx4="http://schemas.microsoft.com/office/drawing/2016/5/10/chartex" xmlns:cx5="http://schemas.microsoft.com/office/drawing/2016/5/11/chartex" xmlns:cx6="http://schemas.microsoft.com/office/drawing/2016/5/12/chartex" xmlns:cx7="http://schemas.microsoft.com/office/drawing/2016/5/13/chartex" xmlns:cx8="http://schemas.microsoft.com/office/drawing/2016/5/14/chartex" xmlns:mc="http://schemas.openxmlformats.org/markup-compatibility/2006" xmlns:aink="http://schemas.microsoft.com/office/drawing/2016/ink" xmlns:am3d="http://schemas.microsoft.com/office/drawing/2017/model3d" xmlns:o="urn:schemas-microsoft-com:office:office" xmlns:oel="http://schemas.microsoft.com/office/2019/extlst" xmlns:r="http://schemas.openxmlformats.org/officeDocument/2006/relationships" xmlns:m="http://schemas.openxmlformats.org/officeDocument/2006/math" xmlns:v="urn:schemas-microsoft-com:vml" xmlns:wp14="http://schemas.microsoft.com/office/word/2010/wordprocessingDrawing" xmlns:wp="http://schemas.openxmlformats.org/drawingml/2006/wordprocessingDrawing" xmlns:w10="urn:schemas-microsoft-com:office:word" xmlns:w="http://schemas.openxmlformats.org/wordprocessingml/2006/main" xmlns:w14="http://schemas.microsoft.com/office/word/2010/wordml" xmlns:w15="http://schemas.microsoft.com/office/word/2012/wordml" xmlns:w16cex="http://schemas.microsoft.com/office/word/2018/wordml/cex" xmlns:w16cid="http://schemas.microsoft.com/office/word/2016/wordml/cid" xmlns:w16="http://schemas.microsoft.com/office/word/2018/wordml" xmlns:w16du="http://schemas.microsoft.com/office/word/2023/wordml/word16du" xmlns:w16sdtdh="http://schemas.microsoft.com/office/word/2020/wordml/sdtdatahash" xmlns:w16sdtfl="http://schemas.microsoft.com/office/word/2024/wordml/sdtformatlock" xmlns:w16se="http://schemas.microsoft.com/office/word/2015/wordml/symex" xmlns:wpg="http://schemas.microsoft.com/office/word/2010/wordprocessingGroup" xmlns:wpi="http://schemas.microsoft.com/office/word/2010/wordprocessingInk" xmlns:wne="http://schemas.microsoft.com/office/word/2006/wordml" xmlns:wps="http://schemas.microsoft.com/office/word/2010/wordprocessingShape" mc:Ignorable="w14 w15 w16se w16cid w16 w16cex w16sdtdh w16sdtfl w16du wp14">
+<w:document xmlns:wpc="http://schemas.microsoft.com/office/word/2010/wordprocessingCanvas" xmlns:cx="http://schemas.microsoft.com/office/drawing/2014/chartex" xmlns:cx1="http://schemas.microsoft.com/office/drawing/2015/9/8/chartex" xmlns:cx2="http://schemas.microsoft.com/office/drawing/2015/10/21/chartex" xmlns:cx3="http://schemas.microsoft.com/office/drawing/2016/5/9/chartex" xmlns:cx4="http://schemas.microsoft.com/office/drawing/2016/5/10/chartex" xmlns:cx5="http://schemas.microsoft.com/office/drawing/2016/5/11/chartex" xmlns:cx6="http://schemas.microsoft.com/office/drawing/2016/5/12/chartex" xmlns:cx7="http://schemas.microsoft.com/office/drawing/2016/5/13/chartex" xmlns:cx8="http://schemas.microsoft.com/office/drawing/2016/5/14/chartex" xmlns:mc="http://schemas.openxmlformats.org/markup-compatibility/2006" xmlns:aink="http://schemas.microsoft.com/office/drawing/2016/ink" xmlns:am3d="http://schemas.microsoft.com/office/drawing/2017/model3d" xmlns:o="urn:schemas-microsoft-com:office:office" xmlns:oel="http://schemas.microsoft.com/office/2019/extlst" xmlns:r="http://schemas.openxmlformats.org/officeDocument/2006/relationships" xmlns:m="http://schemas.openxmlformats.org/officeDocument/2006/math" xmlns:v="urn:schemas-microsoft-com:vml" xmlns:wp14="http://schemas.microsoft.com/office/word/2010/wordprocessingDrawing" xmlns:wp="http://schemas.openxmlformats.org/drawingml/2006/wordprocessingDrawing" xmlns:w10="urn:schemas-microsoft-com:office:word" xmlns:w="http://schemas.openxmlformats.org/wordprocessingml/2006/main" xmlns:w14="http://schemas.microsoft.com/office/word/2010/wordml" xmlns:w15="http://schemas.microsoft.com/office/word/2012/wordml" xmlns:w16cei="http://schemas.microsoft.com/office/word/2026/wordml/cei" xmlns:w16cex="http://schemas.microsoft.com/office/word/2018/wordml/cex" xmlns:w16cid="http://schemas.microsoft.com/office/word/2016/wordml/cid" xmlns:w16="http://schemas.microsoft.com/office/word/2018/wordml" xmlns:w16du="http://schemas.microsoft.com/office/word/2023/wordml/word16du" xmlns:w16sdtdh="http://schemas.microsoft.com/office/word/2020/wordml/sdtdatahash" xmlns:w16sdtfl="http://schemas.microsoft.com/office/word/2024/wordml/sdtformatlock" xmlns:w16se="http://schemas.microsoft.com/office/word/2015/wordml/symex" xmlns:wpg="http://schemas.microsoft.com/office/word/2010/wordprocessingGroup" xmlns:wpi="http://schemas.microsoft.com/office/word/2010/wordprocessingInk" xmlns:wne="http://schemas.microsoft.com/office/word/2006/wordml" xmlns:wps="http://schemas.microsoft.com/office/word/2010/wordprocessingShape" mc:Ignorable="w14 w15 w16se w16cid w16 w16cex w16sdtdh w16sdtfl w16du wp14">
   <w:body>
     <w:p>
       <w:pPr>
@@ -104,7 +104,7 @@
           <w:position w:val="-3"/>
         </w:rPr>
         <w:drawing>
-          <wp:anchor distT="0" distB="0" distL="114300" distR="114300" simplePos="0" relativeHeight="487591936" behindDoc="0" locked="0" layoutInCell="1" allowOverlap="1" wp14:anchorId="4288A6A1" wp14:editId="548A098B">
+          <wp:anchor distT="0" distB="0" distL="114300" distR="114300" simplePos="0" relativeHeight="487591936" behindDoc="0" locked="0" layoutInCell="1" allowOverlap="1" wp14:anchorId="4288A6A1" wp14:editId="35598853">
             <wp:simplePos x="0" y="0"/>
             <wp:positionH relativeFrom="column">
               <wp:posOffset>1406398</wp:posOffset>
@@ -161,7 +161,7 @@
           <w:position w:val="-2"/>
         </w:rPr>
         <w:drawing>
-          <wp:anchor distT="0" distB="0" distL="114300" distR="114300" simplePos="0" relativeHeight="487590912" behindDoc="0" locked="0" layoutInCell="1" allowOverlap="1" wp14:anchorId="6D1DDFF6" wp14:editId="34419F53">
+          <wp:anchor distT="0" distB="0" distL="114300" distR="114300" simplePos="0" relativeHeight="487590912" behindDoc="0" locked="0" layoutInCell="1" allowOverlap="1" wp14:anchorId="6D1DDFF6" wp14:editId="1B5F62AF">
             <wp:simplePos x="0" y="0"/>
             <wp:positionH relativeFrom="column">
               <wp:posOffset>2244725</wp:posOffset>
@@ -880,7 +880,7 @@
           <w:sz w:val="20"/>
           <w:szCs w:val="20"/>
         </w:rPr>
-        <w:t>7.16</w:t>
+        <w:t>6.9</w:t>
       </w:r>
       <w:r>
         <w:rPr>
@@ -891,7 +891,7 @@
           <w:sz w:val="20"/>
           <w:szCs w:val="20"/>
         </w:rPr>
-        <w:t xml:space="preserve"> </w:t>
+        <w:t>1</w:t>
       </w:r>
       <w:r>
         <w:rPr>
@@ -2649,7 +2649,244 @@
           <w:sz w:val="28"/>
           <w:szCs w:val="28"/>
         </w:rPr>
-        <w:t xml:space="preserve">Experience </w:t>
+        <w:t>Experien</w:t>
+      </w:r>
+      <w:r>
+        <w:rPr>
+          <w:rFonts w:ascii="Times New Roman" w:hAnsi="Times New Roman" w:cs="Times New Roman"/>
+          <w:spacing w:val="-2"/>
+          <w:w w:val="115"/>
+          <w:sz w:val="28"/>
+          <w:szCs w:val="28"/>
+        </w:rPr>
+        <w:t xml:space="preserve">ce </w:t>
+      </w:r>
+    </w:p>
+    <w:p>
+      <w:pPr>
+        <w:pStyle w:val="Heading1"/>
+        <w:spacing w:before="129"/>
+        <w:jc w:val="both"/>
+        <w:rPr>
+          <w:rFonts w:ascii="Times New Roman" w:hAnsi="Times New Roman" w:cs="Times New Roman"/>
+          <w:spacing w:val="-2"/>
+          <w:w w:val="115"/>
+          <w:sz w:val="22"/>
+          <w:szCs w:val="22"/>
+        </w:rPr>
+      </w:pPr>
+      <w:r>
+        <w:rPr>
+          <w:rFonts w:ascii="Times New Roman" w:hAnsi="Times New Roman" w:cs="Times New Roman"/>
+          <w:spacing w:val="-2"/>
+          <w:w w:val="115"/>
+          <w:sz w:val="22"/>
+          <w:szCs w:val="22"/>
+        </w:rPr>
+        <w:t>Technical Co-Head, ACM Student Chapter | NMAMIT</w:t>
+      </w:r>
+      <w:r>
+        <w:rPr>
+          <w:rFonts w:ascii="Times New Roman" w:hAnsi="Times New Roman" w:cs="Times New Roman"/>
+          <w:spacing w:val="-2"/>
+          <w:w w:val="115"/>
+          <w:sz w:val="22"/>
+          <w:szCs w:val="22"/>
+        </w:rPr>
+        <w:tab/>
+      </w:r>
+      <w:r>
+        <w:rPr>
+          <w:rFonts w:ascii="Times New Roman" w:hAnsi="Times New Roman" w:cs="Times New Roman"/>
+          <w:spacing w:val="-2"/>
+          <w:w w:val="115"/>
+          <w:sz w:val="22"/>
+          <w:szCs w:val="22"/>
+        </w:rPr>
+        <w:tab/>
+      </w:r>
+      <w:r>
+        <w:rPr>
+          <w:rFonts w:ascii="Times New Roman" w:hAnsi="Times New Roman" w:cs="Times New Roman"/>
+          <w:spacing w:val="-2"/>
+          <w:w w:val="115"/>
+          <w:sz w:val="22"/>
+          <w:szCs w:val="22"/>
+        </w:rPr>
+        <w:tab/>
+      </w:r>
+      <w:r>
+        <w:rPr>
+          <w:rFonts w:ascii="Times New Roman" w:hAnsi="Times New Roman" w:cs="Times New Roman"/>
+          <w:spacing w:val="-2"/>
+          <w:w w:val="115"/>
+          <w:sz w:val="22"/>
+          <w:szCs w:val="22"/>
+        </w:rPr>
+        <w:tab/>
+        <w:t xml:space="preserve"> Jul</w:t>
+      </w:r>
+      <w:r>
+        <w:rPr>
+          <w:rFonts w:ascii="Times New Roman" w:hAnsi="Times New Roman" w:cs="Times New Roman"/>
+          <w:spacing w:val="-2"/>
+          <w:w w:val="115"/>
+          <w:sz w:val="22"/>
+          <w:szCs w:val="22"/>
+        </w:rPr>
+        <w:t xml:space="preserve"> 2026 – Present</w:t>
+      </w:r>
+    </w:p>
+    <w:p>
+      <w:pPr>
+        <w:pStyle w:val="Heading1"/>
+        <w:numPr>
+          <w:ilvl w:val="0"/>
+          <w:numId w:val="16"/>
+        </w:numPr>
+        <w:spacing w:before="129"/>
+        <w:jc w:val="both"/>
+        <w:rPr>
+          <w:rFonts w:ascii="Times New Roman" w:hAnsi="Times New Roman" w:cs="Times New Roman"/>
+          <w:b w:val="0"/>
+          <w:bCs w:val="0"/>
+          <w:spacing w:val="-2"/>
+          <w:w w:val="115"/>
+          <w:sz w:val="20"/>
+          <w:szCs w:val="20"/>
+        </w:rPr>
+      </w:pPr>
+      <w:r>
+        <w:rPr>
+          <w:rFonts w:ascii="Times New Roman" w:hAnsi="Times New Roman" w:cs="Times New Roman"/>
+          <w:b w:val="0"/>
+          <w:bCs w:val="0"/>
+          <w:spacing w:val="-2"/>
+          <w:w w:val="115"/>
+          <w:sz w:val="20"/>
+          <w:szCs w:val="20"/>
+        </w:rPr>
+        <w:t>Co-managing the club's technical committee and digital platforms.</w:t>
+      </w:r>
+    </w:p>
+    <w:p>
+      <w:pPr>
+        <w:pStyle w:val="Heading1"/>
+        <w:numPr>
+          <w:ilvl w:val="0"/>
+          <w:numId w:val="16"/>
+        </w:numPr>
+        <w:spacing w:before="129"/>
+        <w:jc w:val="both"/>
+        <w:rPr>
+          <w:rFonts w:ascii="Times New Roman" w:hAnsi="Times New Roman" w:cs="Times New Roman"/>
+          <w:b w:val="0"/>
+          <w:bCs w:val="0"/>
+          <w:spacing w:val="-2"/>
+          <w:w w:val="115"/>
+          <w:sz w:val="20"/>
+          <w:szCs w:val="20"/>
+        </w:rPr>
+      </w:pPr>
+      <w:r>
+        <w:rPr>
+          <w:rFonts w:ascii="Times New Roman" w:hAnsi="Times New Roman" w:cs="Times New Roman"/>
+          <w:b w:val="0"/>
+          <w:bCs w:val="0"/>
+          <w:spacing w:val="-2"/>
+          <w:w w:val="115"/>
+          <w:sz w:val="20"/>
+          <w:szCs w:val="20"/>
+        </w:rPr>
+        <w:t>S</w:t>
+      </w:r>
+      <w:r>
+        <w:rPr>
+          <w:rFonts w:ascii="Times New Roman" w:hAnsi="Times New Roman" w:cs="Times New Roman"/>
+          <w:b w:val="0"/>
+          <w:bCs w:val="0"/>
+          <w:spacing w:val="-2"/>
+          <w:w w:val="115"/>
+          <w:sz w:val="20"/>
+          <w:szCs w:val="20"/>
+        </w:rPr>
+        <w:t>trategizing technical initiatives with the executive board.</w:t>
+      </w:r>
+    </w:p>
+    <w:p>
+      <w:pPr>
+        <w:pStyle w:val="Heading1"/>
+        <w:numPr>
+          <w:ilvl w:val="0"/>
+          <w:numId w:val="16"/>
+        </w:numPr>
+        <w:spacing w:before="129"/>
+        <w:jc w:val="both"/>
+        <w:rPr>
+          <w:rFonts w:ascii="Times New Roman" w:hAnsi="Times New Roman" w:cs="Times New Roman"/>
+          <w:b w:val="0"/>
+          <w:bCs w:val="0"/>
+          <w:spacing w:val="-2"/>
+          <w:w w:val="115"/>
+          <w:sz w:val="20"/>
+          <w:szCs w:val="20"/>
+        </w:rPr>
+      </w:pPr>
+      <w:r>
+        <w:rPr>
+          <w:rFonts w:ascii="Times New Roman" w:hAnsi="Times New Roman" w:cs="Times New Roman"/>
+          <w:b w:val="0"/>
+          <w:bCs w:val="0"/>
+          <w:spacing w:val="-2"/>
+          <w:w w:val="115"/>
+          <w:sz w:val="20"/>
+          <w:szCs w:val="20"/>
+        </w:rPr>
+        <w:t>Planning upcoming hackathons, coding competitions, and tech events</w:t>
+      </w:r>
+      <w:r>
+        <w:rPr>
+          <w:rFonts w:ascii="Times New Roman" w:hAnsi="Times New Roman" w:cs="Times New Roman"/>
+          <w:b w:val="0"/>
+          <w:bCs w:val="0"/>
+          <w:spacing w:val="-2"/>
+          <w:w w:val="115"/>
+          <w:sz w:val="20"/>
+          <w:szCs w:val="20"/>
+        </w:rPr>
+        <w:t xml:space="preserve"> along with the team.</w:t>
+      </w:r>
+    </w:p>
+    <w:p>
+      <w:pPr>
+        <w:pStyle w:val="Heading1"/>
+        <w:numPr>
+          <w:ilvl w:val="0"/>
+          <w:numId w:val="16"/>
+        </w:numPr>
+        <w:spacing w:before="129"/>
+        <w:jc w:val="both"/>
+        <w:rPr>
+          <w:rFonts w:ascii="Times New Roman" w:hAnsi="Times New Roman" w:cs="Times New Roman"/>
+          <w:b w:val="0"/>
+          <w:bCs w:val="0"/>
+          <w:spacing w:val="-2"/>
+          <w:w w:val="115"/>
+          <w:sz w:val="20"/>
+          <w:szCs w:val="20"/>
+        </w:rPr>
+      </w:pPr>
+      <w:r>
+        <w:rPr>
+          <w:rFonts w:ascii="Times New Roman" w:hAnsi="Times New Roman" w:cs="Times New Roman"/>
+          <w:b w:val="0"/>
+          <w:bCs w:val="0"/>
+          <w:spacing w:val="-2"/>
+          <w:w w:val="115"/>
+          <w:sz w:val="20"/>
+          <w:szCs w:val="20"/>
+        </w:rPr>
+        <w:t>Evaluating new tools and tech stacks for club initiatives.</w:t>
       </w:r>
     </w:p>
     <w:p>
@@ -4892,7 +5129,7 @@
 </file>
 
 <file path=word/endnotes.xml><?xml version="1.0" encoding="utf-8"?>
-<w:endnotes xmlns:wpc="http://schemas.microsoft.com/office/word/2010/wordprocessingCanvas" xmlns:cx="http://schemas.microsoft.com/office/drawing/2014/chartex" xmlns:cx1="http://schemas.microsoft.com/office/drawing/2015/9/8/chartex" xmlns:cx2="http://schemas.microsoft.com/office/drawing/2015/10/21/chartex" xmlns:cx3="http://schemas.microsoft.com/office/drawing/2016/5/9/chartex" xmlns:cx4="http://schemas.microsoft.com/office/drawing/2016/5/10/chartex" xmlns:cx5="http://schemas.microsoft.com/office/drawing/2016/5/11/chartex" xmlns:cx6="http://schemas.microsoft.com/office/drawing/2016/5/12/chartex" xmlns:cx7="http://schemas.microsoft.com/office/drawing/2016/5/13/chartex" xmlns:cx8="http://schemas.microsoft.com/office/drawing/2016/5/14/chartex" xmlns:mc="http://schemas.openxmlformats.org/markup-compatibility/2006" xmlns:aink="http://schemas.microsoft.com/office/drawing/2016/ink" xmlns:am3d="http://schemas.microsoft.com/office/drawing/2017/model3d" xmlns:o="urn:schemas-microsoft-com:office:office" xmlns:oel="http://schemas.microsoft.com/office/2019/extlst" xmlns:r="http://schemas.openxmlformats.org/officeDocument/2006/relationships" xmlns:m="http://schemas.openxmlformats.org/officeDocument/2006/math" xmlns:v="urn:schemas-microsoft-com:vml" xmlns:wp14="http://schemas.microsoft.com/office/word/2010/wordprocessingDrawing" xmlns:wp="http://schemas.openxmlformats.org/drawingml/2006/wordprocessingDrawing" xmlns:w10="urn:schemas-microsoft-com:office:word" xmlns:w="http://schemas.openxmlformats.org/wordprocessingml/2006/main" xmlns:w14="http://schemas.microsoft.com/office/word/2010/wordml" xmlns:w15="http://schemas.microsoft.com/office/word/2012/wordml" xmlns:w16cex="http://schemas.microsoft.com/office/word/2018/wordml/cex" xmlns:w16cid="http://schemas.microsoft.com/office/word/2016/wordml/cid" xmlns:w16="http://schemas.microsoft.com/office/word/2018/wordml" xmlns:w16du="http://schemas.microsoft.com/office/word/2023/wordml/word16du" xmlns:w16sdtdh="http://schemas.microsoft.com/office/word/2020/wordml/sdtdatahash" xmlns:w16sdtfl="http://schemas.microsoft.com/office/word/2024/wordml/sdtformatlock" xmlns:w16se="http://schemas.microsoft.com/office/word/2015/wordml/symex" xmlns:wpg="http://schemas.microsoft.com/office/word/2010/wordprocessingGroup" xmlns:wpi="http://schemas.microsoft.com/office/word/2010/wordprocessingInk" xmlns:wne="http://schemas.microsoft.com/office/word/2006/wordml" xmlns:wps="http://schemas.microsoft.com/office/word/2010/wordprocessingShape" mc:Ignorable="w14 w15 w16se w16cid w16 w16cex w16sdtdh w16sdtfl w16du wp14">
+<w:endnotes xmlns:wpc="http://schemas.microsoft.com/office/word/2010/wordprocessingCanvas" xmlns:cx="http://schemas.microsoft.com/office/drawing/2014/chartex" xmlns:cx1="http://schemas.microsoft.com/office/drawing/2015/9/8/chartex" xmlns:cx2="http://schemas.microsoft.com/office/drawing/2015/10/21/chartex" xmlns:cx3="http://schemas.microsoft.com/office/drawing/2016/5/9/chartex" xmlns:cx4="http://schemas.microsoft.com/office/drawing/2016/5/10/chartex" xmlns:cx5="http://schemas.microsoft.com/office/drawing/2016/5/11/chartex" xmlns:cx6="http://schemas.microsoft.com/office/drawing/2016/5/12/chartex" xmlns:cx7="http://schemas.microsoft.com/office/drawing/2016/5/13/chartex" xmlns:cx8="http://schemas.microsoft.com/office/drawing/2016/5/14/chartex" xmlns:mc="http://schemas.openxmlformats.org/markup-compatibility/2006" xmlns:aink="http://schemas.microsoft.com/office/drawing/2016/ink" xmlns:am3d="http://schemas.microsoft.com/office/drawing/2017/model3d" xmlns:o="urn:schemas-microsoft-com:office:office" xmlns:oel="http://schemas.microsoft.com/office/2019/extlst" xmlns:r="http://schemas.openxmlformats.org/officeDocument/2006/relationships" xmlns:m="http://schemas.openxmlformats.org/officeDocument/2006/math" xmlns:v="urn:schemas-microsoft-com:vml" xmlns:wp14="http://schemas.microsoft.com/office/word/2010/wordprocessingDrawing" xmlns:wp="http://schemas.openxmlformats.org/drawingml/2006/wordprocessingDrawing" xmlns:w10="urn:schemas-microsoft-com:office:word" xmlns:w="http://schemas.openxmlformats.org/wordprocessingml/2006/main" xmlns:w14="http://schemas.microsoft.com/office/word/2010/wordml" xmlns:w15="http://schemas.microsoft.com/office/word/2012/wordml" xmlns:w16cei="http://schemas.microsoft.com/office/word/2026/wordml/cei" xmlns:w16cex="http://schemas.microsoft.com/office/word/2018/wordml/cex" xmlns:w16cid="http://schemas.microsoft.com/office/word/2016/wordml/cid" xmlns:w16="http://schemas.microsoft.com/office/word/2018/wordml" xmlns:w16du="http://schemas.microsoft.com/office/word/2023/wordml/word16du" xmlns:w16sdtdh="http://schemas.microsoft.com/office/word/2020/wordml/sdtdatahash" xmlns:w16sdtfl="http://schemas.microsoft.com/office/word/2024/wordml/sdtformatlock" xmlns:w16se="http://schemas.microsoft.com/office/word/2015/wordml/symex" xmlns:wpg="http://schemas.microsoft.com/office/word/2010/wordprocessingGroup" xmlns:wpi="http://schemas.microsoft.com/office/word/2010/wordprocessingInk" xmlns:wne="http://schemas.microsoft.com/office/word/2006/wordml" xmlns:wps="http://schemas.microsoft.com/office/word/2010/wordprocessingShape" mc:Ignorable="w14 w15 w16se w16cid w16 w16cex w16sdtdh w16sdtfl w16du wp14">
   <w:endnote w:type="separator" w:id="-1">
     <w:p>
       <w:r>
@@ -4911,7 +5148,7 @@
 </file>
 
 <file path=word/footnotes.xml><?xml version="1.0" encoding="utf-8"?>
-<w:footnotes xmlns:wpc="http://schemas.microsoft.com/office/word/2010/wordprocessingCanvas" xmlns:cx="http://schemas.microsoft.com/office/drawing/2014/chartex" xmlns:cx1="http://schemas.microsoft.com/office/drawing/2015/9/8/chartex" xmlns:cx2="http://schemas.microsoft.com/office/drawing/2015/10/21/chartex" xmlns:cx3="http://schemas.microsoft.com/office/drawing/2016/5/9/chartex" xmlns:cx4="http://schemas.microsoft.com/office/drawing/2016/5/10/chartex" xmlns:cx5="http://schemas.microsoft.com/office/drawing/2016/5/11/chartex" xmlns:cx6="http://schemas.microsoft.com/office/drawing/2016/5/12/chartex" xmlns:cx7="http://schemas.microsoft.com/office/drawing/2016/5/13/chartex" xmlns:cx8="http://schemas.microsoft.com/office/drawing/2016/5/14/chartex" xmlns:mc="http://schemas.openxmlformats.org/markup-compatibility/2006" xmlns:aink="http://schemas.microsoft.com/office/drawing/2016/ink" xmlns:am3d="http://schemas.microsoft.com/office/drawing/2017/model3d" xmlns:o="urn:schemas-microsoft-com:office:office" xmlns:oel="http://schemas.microsoft.com/office/2019/extlst" xmlns:r="http://schemas.openxmlformats.org/officeDocument/2006/relationships" xmlns:m="http://schemas.openxmlformats.org/officeDocument/2006/math" xmlns:v="urn:schemas-microsoft-com:vml" xmlns:wp14="http://schemas.microsoft.com/office/word/2010/wordprocessingDrawing" xmlns:wp="http://schemas.openxmlformats.org/drawingml/2006/wordprocessingDrawing" xmlns:w10="urn:schemas-microsoft-com:office:word" xmlns:w="http://schemas.openxmlformats.org/wordprocessingml/2006/main" xmlns:w14="http://schemas.microsoft.com/office/word/2010/wordml" xmlns:w15="http://schemas.microsoft.com/office/word/2012/wordml" xmlns:w16cex="http://schemas.microsoft.com/office/word/2018/wordml/cex" xmlns:w16cid="http://schemas.microsoft.com/office/word/2016/wordml/cid" xmlns:w16="http://schemas.microsoft.com/office/word/2018/wordml" xmlns:w16du="http://schemas.microsoft.com/office/word/2023/wordml/word16du" xmlns:w16sdtdh="http://schemas.microsoft.com/office/word/2020/wordml/sdtdatahash" xmlns:w16sdtfl="http://schemas.microsoft.com/office/word/2024/wordml/sdtformatlock" xmlns:w16se="http://schemas.microsoft.com/office/word/2015/wordml/symex" xmlns:wpg="http://schemas.microsoft.com/office/word/2010/wordprocessingGroup" xmlns:wpi="http://schemas.microsoft.com/office/word/2010/wordprocessingInk" xmlns:wne="http://schemas.microsoft.com/office/word/2006/wordml" xmlns:wps="http://schemas.microsoft.com/office/word/2010/wordprocessingShape" mc:Ignorable="w14 w15 w16se w16cid w16 w16cex w16sdtdh w16sdtfl w16du wp14">
+<w:footnotes xmlns:wpc="http://schemas.microsoft.com/office/word/2010/wordprocessingCanvas" xmlns:cx="http://schemas.microsoft.com/office/drawing/2014/chartex" xmlns:cx1="http://schemas.microsoft.com/office/drawing/2015/9/8/chartex" xmlns:cx2="http://schemas.microsoft.com/office/drawing/2015/10/21/chartex" xmlns:cx3="http://schemas.microsoft.com/office/drawing/2016/5/9/chartex" xmlns:cx4="http://schemas.microsoft.com/office/drawing/2016/5/10/chartex" xmlns:cx5="http://schemas.microsoft.com/office/drawing/2016/5/11/chartex" xmlns:cx6="http://schemas.microsoft.com/office/drawing/2016/5/12/chartex" xmlns:cx7="http://schemas.microsoft.com/office/drawing/2016/5/13/chartex" xmlns:cx8="http://schemas.microsoft.com/office/drawing/2016/5/14/chartex" xmlns:mc="http://schemas.openxmlformats.org/markup-compatibility/2006" xmlns:aink="http://schemas.microsoft.com/office/drawing/2016/ink" xmlns:am3d="http://schemas.microsoft.com/office/drawing/2017/model3d" xmlns:o="urn:schemas-microsoft-com:office:office" xmlns:oel="http://schemas.microsoft.com/office/2019/extlst" xmlns:r="http://schemas.openxmlformats.org/officeDocument/2006/relationships" xmlns:m="http://schemas.openxmlformats.org/officeDocument/2006/math" xmlns:v="urn:schemas-microsoft-com:vml" xmlns:wp14="http://schemas.microsoft.com/office/word/2010/wordprocessingDrawing" xmlns:wp="http://schemas.openxmlformats.org/drawingml/2006/wordprocessingDrawing" xmlns:w10="urn:schemas-microsoft-com:office:word" xmlns:w="http://schemas.openxmlformats.org/wordprocessingml/2006/main" xmlns:w14="http://schemas.microsoft.com/office/word/2010/wordml" xmlns:w15="http://schemas.microsoft.com/office/word/2012/wordml" xmlns:w16cei="http://schemas.microsoft.com/office/word/2026/wordml/cei" xmlns:w16cex="http://schemas.microsoft.com/office/word/2018/wordml/cex" xmlns:w16cid="http://schemas.microsoft.com/office/word/2016/wordml/cid" xmlns:w16="http://schemas.microsoft.com/office/word/2018/wordml" xmlns:w16du="http://schemas.microsoft.com/office/word/2023/wordml/word16du" xmlns:w16sdtdh="http://schemas.microsoft.com/office/word/2020/wordml/sdtdatahash" xmlns:w16sdtfl="http://schemas.microsoft.com/office/word/2024/wordml/sdtformatlock" xmlns:w16se="http://schemas.microsoft.com/office/word/2015/wordml/symex" xmlns:wpg="http://schemas.microsoft.com/office/word/2010/wordprocessingGroup" xmlns:wpi="http://schemas.microsoft.com/office/word/2010/wordprocessingInk" xmlns:wne="http://schemas.microsoft.com/office/word/2006/wordml" xmlns:wps="http://schemas.microsoft.com/office/word/2010/wordprocessingShape" mc:Ignorable="w14 w15 w16se w16cid w16 w16cex w16sdtdh w16sdtfl w16du wp14">
   <w:footnote w:type="separator" w:id="-1">
     <w:p>
       <w:r>
@@ -4930,7 +5167,7 @@
 </file>
 
 <file path=word/numbering.xml><?xml version="1.0" encoding="utf-8"?>
-<w:numbering xmlns:wpc="http://schemas.microsoft.com/office/word/2010/wordprocessingCanvas" xmlns:cx="http://schemas.microsoft.com/office/drawing/2014/chartex" xmlns:cx1="http://schemas.microsoft.com/office/drawing/2015/9/8/chartex" xmlns:cx2="http://schemas.microsoft.com/office/drawing/2015/10/21/chartex" xmlns:cx3="http://schemas.microsoft.com/office/drawing/2016/5/9/chartex" xmlns:cx4="http://schemas.microsoft.com/office/drawing/2016/5/10/chartex" xmlns:cx5="http://schemas.microsoft.com/office/drawing/2016/5/11/chartex" xmlns:cx6="http://schemas.microsoft.com/office/drawing/2016/5/12/chartex" xmlns:cx7="http://schemas.microsoft.com/office/drawing/2016/5/13/chartex" xmlns:cx8="http://schemas.microsoft.com/office/drawing/2016/5/14/chartex" xmlns:mc="http://schemas.openxmlformats.org/markup-compatibility/2006" xmlns:aink="http://schemas.microsoft.com/office/drawing/2016/ink" xmlns:am3d="http://schemas.microsoft.com/office/drawing/2017/model3d" xmlns:o="urn:schemas-microsoft-com:office:office" xmlns:oel="http://schemas.microsoft.com/office/2019/extlst" xmlns:r="http://schemas.openxmlformats.org/officeDocument/2006/relationships" xmlns:m="http://schemas.openxmlformats.org/officeDocument/2006/math" xmlns:v="urn:schemas-microsoft-com:vml" xmlns:wp14="http://schemas.microsoft.com/office/word/2010/wordprocessingDrawing" xmlns:wp="http://schemas.openxmlformats.org/drawingml/2006/wordprocessingDrawing" xmlns:w10="urn:schemas-microsoft-com:office:word" xmlns:w="http://schemas.openxmlformats.org/wordprocessingml/2006/main" xmlns:w14="http://schemas.microsoft.com/office/word/2010/wordml" xmlns:w15="http://schemas.microsoft.com/office/word/2012/wordml" xmlns:w16cex="http://schemas.microsoft.com/office/word/2018/wordml/cex" xmlns:w16cid="http://schemas.microsoft.com/office/word/2016/wordml/cid" xmlns:w16="http://schemas.microsoft.com/office/word/2018/wordml" xmlns:w16du="http://schemas.microsoft.com/office/word/2023/wordml/word16du" xmlns:w16sdtdh="http://schemas.microsoft.com/office/word/2020/wordml/sdtdatahash" xmlns:w16sdtfl="http://schemas.microsoft.com/office/word/2024/wordml/sdtformatlock" xmlns:w16se="http://schemas.microsoft.com/office/word/2015/wordml/symex" xmlns:wpg="http://schemas.microsoft.com/office/word/2010/wordprocessingGroup" xmlns:wpi="http://schemas.microsoft.com/office/word/2010/wordprocessingInk" xmlns:wne="http://schemas.microsoft.com/office/word/2006/wordml" xmlns:wps="http://schemas.microsoft.com/office/word/2010/wordprocessingShape" mc:Ignorable="w14 w15 w16se w16cid w16 w16cex w16sdtdh w16sdtfl w16du wp14">
+<w:numbering xmlns:wpc="http://schemas.microsoft.com/office/word/2010/wordprocessingCanvas" xmlns:cx="http://schemas.microsoft.com/office/drawing/2014/chartex" xmlns:cx1="http://schemas.microsoft.com/office/drawing/2015/9/8/chartex" xmlns:cx2="http://schemas.microsoft.com/office/drawing/2015/10/21/chartex" xmlns:cx3="http://schemas.microsoft.com/office/drawing/2016/5/9/chartex" xmlns:cx4="http://schemas.microsoft.com/office/drawing/2016/5/10/chartex" xmlns:cx5="http://schemas.microsoft.com/office/drawing/2016/5/11/chartex" xmlns:cx6="http://schemas.microsoft.com/office/drawing/2016/5/12/chartex" xmlns:cx7="http://schemas.microsoft.com/office/drawing/2016/5/13/chartex" xmlns:cx8="http://schemas.microsoft.com/office/drawing/2016/5/14/chartex" xmlns:mc="http://schemas.openxmlformats.org/markup-compatibility/2006" xmlns:aink="http://schemas.microsoft.com/office/drawing/2016/ink" xmlns:am3d="http://schemas.microsoft.com/office/drawing/2017/model3d" xmlns:o="urn:schemas-microsoft-com:office:office" xmlns:oel="http://schemas.microsoft.com/office/2019/extlst" xmlns:r="http://schemas.openxmlformats.org/officeDocument/2006/relationships" xmlns:m="http://schemas.openxmlformats.org/officeDocument/2006/math" xmlns:v="urn:schemas-microsoft-com:vml" xmlns:wp14="http://schemas.microsoft.com/office/word/2010/wordprocessingDrawing" xmlns:wp="http://schemas.openxmlformats.org/drawingml/2006/wordprocessingDrawing" xmlns:w10="urn:schemas-microsoft-com:office:word" xmlns:w="http://schemas.openxmlformats.org/wordprocessingml/2006/main" xmlns:w14="http://schemas.microsoft.com/office/word/2010/wordml" xmlns:w15="http://schemas.microsoft.com/office/word/2012/wordml" xmlns:w16cei="http://schemas.microsoft.com/office/word/2026/wordml/cei" xmlns:w16cex="http://schemas.microsoft.com/office/word/2018/wordml/cex" xmlns:w16cid="http://schemas.microsoft.com/office/word/2016/wordml/cid" xmlns:w16="http://schemas.microsoft.com/office/word/2018/wordml" xmlns:w16du="http://schemas.microsoft.com/office/word/2023/wordml/word16du" xmlns:w16sdtdh="http://schemas.microsoft.com/office/word/2020/wordml/sdtdatahash" xmlns:w16sdtfl="http://schemas.microsoft.com/office/word/2024/wordml/sdtformatlock" xmlns:w16se="http://schemas.microsoft.com/office/word/2015/wordml/symex" xmlns:wpg="http://schemas.microsoft.com/office/word/2010/wordprocessingGroup" xmlns:wpi="http://schemas.microsoft.com/office/word/2010/wordprocessingInk" xmlns:wne="http://schemas.microsoft.com/office/word/2006/wordml" xmlns:wps="http://schemas.microsoft.com/office/word/2010/wordprocessingShape" mc:Ignorable="w14 w15 w16se w16cid w16 w16cex w16sdtdh w16sdtfl w16du wp14">
   <w:abstractNum w:abstractNumId="0" w15:restartNumberingAfterBreak="0">
     <w:nsid w:val="079C15A1"/>
     <w:multiLevelType w:val="hybridMultilevel"/>
@@ -6390,6 +6627,119 @@
     </w:lvl>
   </w:abstractNum>
   <w:abstractNum w:abstractNumId="11" w15:restartNumberingAfterBreak="0">
+    <w:nsid w:val="53D67727"/>
+    <w:multiLevelType w:val="hybridMultilevel"/>
+    <w:tmpl w:val="ED022DAA"/>
+    <w:lvl w:ilvl="0" w:tplc="40090001">
+      <w:start w:val="1"/>
+      <w:numFmt w:val="bullet"/>
+      <w:lvlText w:val=""/>
+      <w:lvlJc w:val="left"/>
+      <w:pPr>
+        <w:ind w:left="836" w:hanging="360"/>
+      </w:pPr>
+      <w:rPr>
+        <w:rFonts w:ascii="Symbol" w:hAnsi="Symbol" w:hint="default"/>
+      </w:rPr>
+    </w:lvl>
+    <w:lvl w:ilvl="1" w:tplc="40090003" w:tentative="1">
+      <w:start w:val="1"/>
+      <w:numFmt w:val="bullet"/>
+      <w:lvlText w:val="o"/>
+      <w:lvlJc w:val="left"/>
+      <w:pPr>
+        <w:ind w:left="1556" w:hanging="360"/>
+      </w:pPr>
+      <w:rPr>
+        <w:rFonts w:ascii="Courier New" w:hAnsi="Courier New" w:cs="Courier New" w:hint="default"/>
+      </w:rPr>
+    </w:lvl>
+    <w:lvl w:ilvl="2" w:tplc="40090005" w:tentative="1">
+      <w:start w:val="1"/>
+      <w:numFmt w:val="bullet"/>
+      <w:lvlText w:val=""/>
+      <w:lvlJc w:val="left"/>
+      <w:pPr>
+        <w:ind w:left="2276" w:hanging="360"/>
+      </w:pPr>
+      <w:rPr>
+        <w:rFonts w:ascii="Wingdings" w:hAnsi="Wingdings" w:hint="default"/>
+      </w:rPr>
+    </w:lvl>
+    <w:lvl w:ilvl="3" w:tplc="40090001" w:tentative="1">
+      <w:start w:val="1"/>
+      <w:numFmt w:val="bullet"/>
+      <w:lvlText w:val=""/>
+      <w:lvlJc w:val="left"/>
+      <w:pPr>
+        <w:ind w:left="2996" w:hanging="360"/>
+      </w:pPr>
+      <w:rPr>
+        <w:rFonts w:ascii="Symbol" w:hAnsi="Symbol" w:hint="default"/>
+      </w:rPr>
+    </w:lvl>
+    <w:lvl w:ilvl="4" w:tplc="40090003" w:tentative="1">
+      <w:start w:val="1"/>
+      <w:numFmt w:val="bullet"/>
+      <w:lvlText w:val="o"/>
+      <w:lvlJc w:val="left"/>
+      <w:pPr>
+        <w:ind w:left="3716" w:hanging="360"/>
+      </w:pPr>
+      <w:rPr>
+        <w:rFonts w:ascii="Courier New" w:hAnsi="Courier New" w:cs="Courier New" w:hint="default"/>
+      </w:rPr>
+    </w:lvl>
+    <w:lvl w:ilvl="5" w:tplc="40090005" w:tentative="1">
+      <w:start w:val="1"/>
+      <w:numFmt w:val="bullet"/>
+      <w:lvlText w:val=""/>
+      <w:lvlJc w:val="left"/>
+      <w:pPr>
+        <w:ind w:left="4436" w:hanging="360"/>
+      </w:pPr>
+      <w:rPr>
+        <w:rFonts w:ascii="Wingdings" w:hAnsi="Wingdings" w:hint="default"/>
+      </w:rPr>
+    </w:lvl>
+    <w:lvl w:ilvl="6" w:tplc="40090001" w:tentative="1">
+      <w:start w:val="1"/>
+      <w:numFmt w:val="bullet"/>
+      <w:lvlText w:val=""/>
+      <w:lvlJc w:val="left"/>
+      <w:pPr>
+        <w:ind w:left="5156" w:hanging="360"/>
+      </w:pPr>
+      <w:rPr>
+        <w:rFonts w:ascii="Symbol" w:hAnsi="Symbol" w:hint="default"/>
+      </w:rPr>
+    </w:lvl>
+    <w:lvl w:ilvl="7" w:tplc="40090003" w:tentative="1">
+      <w:start w:val="1"/>
+      <w:numFmt w:val="bullet"/>
+      <w:lvlText w:val="o"/>
+      <w:lvlJc w:val="left"/>
+      <w:pPr>
+        <w:ind w:left="5876" w:hanging="360"/>
+      </w:pPr>
+      <w:rPr>
+        <w:rFonts w:ascii="Courier New" w:hAnsi="Courier New" w:cs="Courier New" w:hint="default"/>
+      </w:rPr>
+    </w:lvl>
+    <w:lvl w:ilvl="8" w:tplc="40090005" w:tentative="1">
+      <w:start w:val="1"/>
+      <w:numFmt w:val="bullet"/>
+      <w:lvlText w:val=""/>
+      <w:lvlJc w:val="left"/>
+      <w:pPr>
+        <w:ind w:left="6596" w:hanging="360"/>
+      </w:pPr>
+      <w:rPr>
+        <w:rFonts w:ascii="Wingdings" w:hAnsi="Wingdings" w:hint="default"/>
+      </w:rPr>
+    </w:lvl>
+  </w:abstractNum>
+  <w:abstractNum w:abstractNumId="12" w15:restartNumberingAfterBreak="0">
     <w:nsid w:val="6012588C"/>
     <w:multiLevelType w:val="hybridMultilevel"/>
     <w:tmpl w:val="912A8106"/>
@@ -6502,7 +6852,7 @@
       </w:rPr>
     </w:lvl>
   </w:abstractNum>
-  <w:abstractNum w:abstractNumId="12" w15:restartNumberingAfterBreak="0">
+  <w:abstractNum w:abstractNumId="13" w15:restartNumberingAfterBreak="0">
     <w:nsid w:val="6BDF23B1"/>
     <w:multiLevelType w:val="hybridMultilevel"/>
     <w:tmpl w:val="039E201E"/>
@@ -6623,7 +6973,7 @@
       </w:rPr>
     </w:lvl>
   </w:abstractNum>
-  <w:abstractNum w:abstractNumId="13" w15:restartNumberingAfterBreak="0">
+  <w:abstractNum w:abstractNumId="14" w15:restartNumberingAfterBreak="0">
     <w:nsid w:val="6E1E50FA"/>
     <w:multiLevelType w:val="hybridMultilevel"/>
     <w:tmpl w:val="91CA68D2"/>
@@ -6736,7 +7086,7 @@
       </w:rPr>
     </w:lvl>
   </w:abstractNum>
-  <w:abstractNum w:abstractNumId="14" w15:restartNumberingAfterBreak="0">
+  <w:abstractNum w:abstractNumId="15" w15:restartNumberingAfterBreak="0">
     <w:nsid w:val="777A4900"/>
     <w:multiLevelType w:val="hybridMultilevel"/>
     <w:tmpl w:val="6EC4E05A"/>
@@ -6852,10 +7202,10 @@
     </w:lvl>
   </w:abstractNum>
   <w:num w:numId="1" w16cid:durableId="2120635848">
-    <w:abstractNumId w:val="12"/>
+    <w:abstractNumId w:val="13"/>
   </w:num>
   <w:num w:numId="2" w16cid:durableId="1006439660">
-    <w:abstractNumId w:val="11"/>
+    <w:abstractNumId w:val="12"/>
   </w:num>
   <w:num w:numId="3" w16cid:durableId="1087313004">
     <w:abstractNumId w:val="9"/>
@@ -6873,7 +7223,7 @@
     <w:abstractNumId w:val="1"/>
   </w:num>
   <w:num w:numId="8" w16cid:durableId="1526289840">
-    <w:abstractNumId w:val="14"/>
+    <w:abstractNumId w:val="15"/>
   </w:num>
   <w:num w:numId="9" w16cid:durableId="987516099">
     <w:abstractNumId w:val="7"/>
@@ -6891,10 +7241,13 @@
     <w:abstractNumId w:val="0"/>
   </w:num>
   <w:num w:numId="14" w16cid:durableId="761342003">
-    <w:abstractNumId w:val="13"/>
+    <w:abstractNumId w:val="14"/>
   </w:num>
   <w:num w:numId="15" w16cid:durableId="1514995996">
     <w:abstractNumId w:val="8"/>
+  </w:num>
+  <w:num w:numId="16" w16cid:durableId="1774544484">
+    <w:abstractNumId w:val="11"/>
   </w:num>
 </w:numbering>
 </file>
@@ -7341,7 +7694,6 @@
   <w:style w:type="character" w:default="1" w:styleId="DefaultParagraphFont">
     <w:name w:val="Default Paragraph Font"/>
     <w:uiPriority w:val="1"/>
-    <w:semiHidden/>
     <w:unhideWhenUsed/>
   </w:style>
   <w:style w:type="table" w:default="1" w:styleId="TableNormal">

</xml_diff>